<commit_message>
Update README and docx again..
</commit_message>
<xml_diff>
--- a/680.22 Аббасов Мурад.docx
+++ b/680.22 Аббасов Мурад.docx
@@ -230,7 +230,7 @@
         <w:rPr>
           <w:b/>
           <w:bCs/>
-          <w:sz w:val="36"/>
+          <w:sz w:val="40"/>
           <w:szCs w:val="40"/>
         </w:rPr>
       </w:pPr>
@@ -247,10 +247,10 @@
         <w:rPr>
           <w:b/>
           <w:bCs/>
-          <w:sz w:val="44"/>
-          <w:szCs w:val="48"/>
-        </w:rPr>
-        <w:t>стажировке</w:t>
+          <w:sz w:val="40"/>
+          <w:szCs w:val="40"/>
+        </w:rPr>
+        <w:t>производственной практике</w:t>
       </w:r>
     </w:p>
     <w:p>
@@ -1021,12 +1021,267 @@
         </w:rPr>
       </w:pPr>
       <w:r>
+        <w:lastRenderedPageBreak/>
+        <w:tab/>
+      </w:r>
+      <w:r>
         <w:rPr>
           <w:b/>
           <w:bCs/>
           <w:sz w:val="40"/>
           <w:szCs w:val="36"/>
         </w:rPr>
+        <w:t>REFERAT</w:t>
+      </w:r>
+    </w:p>
+    <w:p>
+      <w:pPr>
+        <w:spacing w:line="276" w:lineRule="auto"/>
+        <w:jc w:val="center"/>
+        <w:rPr>
+          <w:b/>
+          <w:bCs/>
+          <w:szCs w:val="22"/>
+        </w:rPr>
+      </w:pPr>
+    </w:p>
+    <w:p>
+      <w:pPr>
+        <w:spacing w:line="276" w:lineRule="auto"/>
+        <w:jc w:val="both"/>
+        <w:rPr>
+          <w:sz w:val="28"/>
+        </w:rPr>
+      </w:pPr>
+      <w:r>
+        <w:rPr>
+          <w:sz w:val="28"/>
+        </w:rPr>
+        <w:t>İstehsalat təcrübəsi haqqında hesabat tələbənin əldə etdiyi nəzəri bilikləri, praktiki bacarıqları və təcrübəni komissiya qarşısında təqdim etmək məqsədi daşıyır. Hesabat giriş, iki əsas bölmə və nəticədən ibarətdir.</w:t>
+      </w:r>
+    </w:p>
+    <w:p>
+      <w:pPr>
+        <w:spacing w:line="276" w:lineRule="auto"/>
+        <w:jc w:val="both"/>
+        <w:rPr>
+          <w:sz w:val="28"/>
+        </w:rPr>
+      </w:pPr>
+    </w:p>
+    <w:p>
+      <w:pPr>
+        <w:spacing w:line="276" w:lineRule="auto"/>
+        <w:jc w:val="both"/>
+        <w:rPr>
+          <w:sz w:val="28"/>
+        </w:rPr>
+      </w:pPr>
+      <w:r>
+        <w:rPr>
+          <w:sz w:val="28"/>
+        </w:rPr>
+        <w:t>Giriş bölməsində təcrübənin keçirildiyi Aerokosmik Agentliyi haqqında ətraflı məlumat təqdim olunur. Agentlik kosmik və aerokosmik sahələrdə fəaliyyət göstərir, həmçinin təbii ehtiyatların tədqiqi ilə məşğul olur.</w:t>
+      </w:r>
+    </w:p>
+    <w:p>
+      <w:pPr>
+        <w:spacing w:line="276" w:lineRule="auto"/>
+        <w:jc w:val="both"/>
+        <w:rPr>
+          <w:sz w:val="28"/>
+        </w:rPr>
+      </w:pPr>
+    </w:p>
+    <w:p>
+      <w:pPr>
+        <w:spacing w:line="276" w:lineRule="auto"/>
+        <w:jc w:val="both"/>
+        <w:rPr>
+          <w:sz w:val="28"/>
+        </w:rPr>
+      </w:pPr>
+      <w:r>
+        <w:rPr>
+          <w:sz w:val="28"/>
+        </w:rPr>
+        <w:t>Hesabatın birinci bölməsində proqram təminatının yığılması sistemləri, onların xüsusiyyətləri və bir-birindən fərqləri müqayisəli şəkildə təsvir olunur. Bundan əlavə, proqram təminatının yığılması prosesində istifadə olunan proqramlar və texnologiyalar haqqında da məlumat verilir.</w:t>
+      </w:r>
+    </w:p>
+    <w:p>
+      <w:pPr>
+        <w:spacing w:line="276" w:lineRule="auto"/>
+        <w:jc w:val="both"/>
+        <w:rPr>
+          <w:sz w:val="28"/>
+        </w:rPr>
+      </w:pPr>
+    </w:p>
+    <w:p>
+      <w:pPr>
+        <w:spacing w:line="276" w:lineRule="auto"/>
+        <w:jc w:val="both"/>
+        <w:rPr>
+          <w:sz w:val="28"/>
+        </w:rPr>
+      </w:pPr>
+      <w:r>
+        <w:rPr>
+          <w:sz w:val="28"/>
+        </w:rPr>
+        <w:t>Hesabatın ikinci bölməsində əsas layihə – C++ proqramlaşdırma dilində hazırlanmış arxivləşdirmə proqramı təqdim olunur. Proqram faylları arxivə sıxışdırmağa və onları arxivdən çıxarmağa imkan verir. Layihə proqram təminatının yığılması sistemlərinin iş prinsipini və funksional imkanlarını müqayisə etmək üçün nümunə kimi istifadə olunur. Proqramın hazırlanma mərhələləri ətraflı şəkildə izah edilir və izahlı şəkillərlə müşayiət olunur. Həmçinin layihənin hazırlanması zamanı istifadə olunan proqram yığma sistemlərinin konfiqurasiyaları haqqında məlumat təqdim edilir.</w:t>
+      </w:r>
+    </w:p>
+    <w:p>
+      <w:pPr>
+        <w:spacing w:line="276" w:lineRule="auto"/>
+        <w:jc w:val="both"/>
+        <w:rPr>
+          <w:sz w:val="28"/>
+        </w:rPr>
+      </w:pPr>
+    </w:p>
+    <w:p>
+      <w:pPr>
+        <w:spacing w:line="276" w:lineRule="auto"/>
+        <w:jc w:val="both"/>
+        <w:rPr>
+          <w:sz w:val="28"/>
+        </w:rPr>
+      </w:pPr>
+      <w:r>
+        <w:rPr>
+          <w:sz w:val="28"/>
+        </w:rPr>
+        <w:t>Nəticə bölməsində təcrübə müddətində əldə olunan əsas texniki biliklər və praktiki bacarıqlar, eləcə də real iş mühiti ilə tanışlıq və layihə düşüncə tərzinin inkişafı vurğulanır.</w:t>
+      </w:r>
+    </w:p>
+    <w:p>
+      <w:pPr>
+        <w:spacing w:line="276" w:lineRule="auto"/>
+        <w:jc w:val="both"/>
+        <w:rPr>
+          <w:sz w:val="28"/>
+        </w:rPr>
+      </w:pPr>
+    </w:p>
+    <w:p>
+      <w:pPr>
+        <w:spacing w:line="276" w:lineRule="auto"/>
+        <w:jc w:val="both"/>
+        <w:rPr>
+          <w:sz w:val="28"/>
+        </w:rPr>
+      </w:pPr>
+    </w:p>
+    <w:p>
+      <w:pPr>
+        <w:spacing w:line="276" w:lineRule="auto"/>
+        <w:jc w:val="both"/>
+        <w:rPr>
+          <w:sz w:val="28"/>
+        </w:rPr>
+      </w:pPr>
+    </w:p>
+    <w:p>
+      <w:pPr>
+        <w:spacing w:line="276" w:lineRule="auto"/>
+        <w:jc w:val="both"/>
+        <w:rPr>
+          <w:sz w:val="28"/>
+        </w:rPr>
+      </w:pPr>
+    </w:p>
+    <w:p>
+      <w:pPr>
+        <w:spacing w:line="276" w:lineRule="auto"/>
+        <w:jc w:val="both"/>
+        <w:rPr>
+          <w:sz w:val="28"/>
+        </w:rPr>
+      </w:pPr>
+    </w:p>
+    <w:p>
+      <w:pPr>
+        <w:spacing w:line="276" w:lineRule="auto"/>
+        <w:jc w:val="both"/>
+        <w:rPr>
+          <w:sz w:val="28"/>
+        </w:rPr>
+      </w:pPr>
+    </w:p>
+    <w:p>
+      <w:pPr>
+        <w:spacing w:line="276" w:lineRule="auto"/>
+        <w:jc w:val="both"/>
+        <w:rPr>
+          <w:sz w:val="28"/>
+        </w:rPr>
+      </w:pPr>
+    </w:p>
+    <w:p>
+      <w:pPr>
+        <w:spacing w:line="276" w:lineRule="auto"/>
+        <w:jc w:val="both"/>
+        <w:rPr>
+          <w:sz w:val="28"/>
+        </w:rPr>
+      </w:pPr>
+    </w:p>
+    <w:p>
+      <w:pPr>
+        <w:spacing w:line="276" w:lineRule="auto"/>
+        <w:jc w:val="both"/>
+        <w:rPr>
+          <w:sz w:val="28"/>
+        </w:rPr>
+      </w:pPr>
+    </w:p>
+    <w:p>
+      <w:pPr>
+        <w:spacing w:line="276" w:lineRule="auto"/>
+        <w:jc w:val="both"/>
+        <w:rPr>
+          <w:sz w:val="28"/>
+        </w:rPr>
+      </w:pPr>
+    </w:p>
+    <w:p>
+      <w:pPr>
+        <w:spacing w:line="276" w:lineRule="auto"/>
+        <w:jc w:val="both"/>
+        <w:rPr>
+          <w:sz w:val="28"/>
+        </w:rPr>
+      </w:pPr>
+    </w:p>
+    <w:p>
+      <w:pPr>
+        <w:spacing w:line="276" w:lineRule="auto"/>
+        <w:jc w:val="both"/>
+        <w:rPr>
+          <w:sz w:val="28"/>
+        </w:rPr>
+      </w:pPr>
+    </w:p>
+    <w:p>
+      <w:pPr>
+        <w:spacing w:line="276" w:lineRule="auto"/>
+        <w:jc w:val="center"/>
+        <w:rPr>
+          <w:b/>
+          <w:bCs/>
+          <w:sz w:val="40"/>
+          <w:szCs w:val="40"/>
+        </w:rPr>
+      </w:pPr>
+      <w:r>
+        <w:rPr>
+          <w:b/>
+          <w:bCs/>
+          <w:sz w:val="40"/>
+          <w:szCs w:val="40"/>
+        </w:rPr>
         <w:lastRenderedPageBreak/>
         <w:t>РЕФЕРАТ</w:t>
       </w:r>
@@ -1034,11 +1289,9 @@
     <w:p>
       <w:pPr>
         <w:spacing w:line="276" w:lineRule="auto"/>
-        <w:jc w:val="center"/>
-        <w:rPr>
-          <w:b/>
-          <w:bCs/>
-          <w:szCs w:val="22"/>
+        <w:jc w:val="both"/>
+        <w:rPr>
+          <w:sz w:val="28"/>
         </w:rPr>
       </w:pPr>
     </w:p>
@@ -1054,31 +1307,7 @@
         <w:rPr>
           <w:sz w:val="28"/>
         </w:rPr>
-        <w:t xml:space="preserve">Отчет о производственной практике направлен на представление полученных студентом теоретических знаний, навыков и опыта перед комиссией. Отчет состоит из </w:t>
-      </w:r>
-      <w:r>
-        <w:rPr>
-          <w:sz w:val="28"/>
-        </w:rPr>
-        <w:t>в</w:t>
-      </w:r>
-      <w:r>
-        <w:rPr>
-          <w:sz w:val="28"/>
-        </w:rPr>
-        <w:t xml:space="preserve">ведения, двух основных разделов и </w:t>
-      </w:r>
-      <w:r>
-        <w:rPr>
-          <w:sz w:val="28"/>
-        </w:rPr>
-        <w:t>результата</w:t>
-      </w:r>
-      <w:r>
-        <w:rPr>
-          <w:sz w:val="28"/>
-        </w:rPr>
-        <w:t>.</w:t>
+        <w:t>Отчет о производственной практике направлен на представление полученных студентом теоретических знаний, навыков и опыта перед комиссией. Отчет состоит из введения, двух основных разделов и результата.</w:t>
       </w:r>
     </w:p>
     <w:p>
@@ -1150,19 +1379,7 @@
         <w:rPr>
           <w:sz w:val="28"/>
         </w:rPr>
-        <w:t>Во втором разделе отчета представлен основной проект – программа-архиватор, написанная на C++. Программа умеет сжимать файлы в архив, а также распаковывать его. Она используется для примера и сравнения работы систем сборки программного обеспечения и их функциональных возможностей. Этап создания программы подробно описывается и содержит пояснительные иллюстрации. Также приведена информация о конфигурациях систем сборки программного обеспечения, использ</w:t>
-      </w:r>
-      <w:r>
-        <w:rPr>
-          <w:sz w:val="28"/>
-        </w:rPr>
-        <w:t>ованных</w:t>
-      </w:r>
-      <w:r>
-        <w:rPr>
-          <w:sz w:val="28"/>
-        </w:rPr>
-        <w:t xml:space="preserve"> при разработке проекта.</w:t>
+        <w:t>Во втором разделе отчета представлен основной проект – программа-архиватор, написанная на C++. Программа умеет сжимать файлы в архив, а также распаковывать его. Она используется для примера и сравнения работы систем сборки программного обеспечения и их функциональных возможностей. Этап создания программы подробно описывается и содержит пояснительные иллюстрации. Также приведена информация о конфигурациях систем сборки программного обеспечения, использованных при разработке проекта.</w:t>
       </w:r>
     </w:p>
     <w:p>
@@ -1186,19 +1403,7 @@
         <w:rPr>
           <w:sz w:val="28"/>
         </w:rPr>
-        <w:t>В разделе "</w:t>
-      </w:r>
-      <w:r>
-        <w:rPr>
-          <w:sz w:val="28"/>
-        </w:rPr>
-        <w:t>Результат</w:t>
-      </w:r>
-      <w:r>
-        <w:rPr>
-          <w:sz w:val="28"/>
-        </w:rPr>
-        <w:t>" подчеркиваются основные технические знания, полученные в ходе практики, а также знакомство с реальной рабочей средой и развитие проектного мышления.</w:t>
+        <w:t>В разделе "Результат" подчеркиваются основные технические знания, полученные в ходе практики, а также знакомство с реальной рабочей средой и развитие проектного мышления.</w:t>
       </w:r>
     </w:p>
     <w:p>
@@ -1266,28 +1471,28 @@
     </w:p>
     <w:p>
       <w:pPr>
-        <w:rPr>
-          <w:sz w:val="28"/>
-        </w:rPr>
-      </w:pPr>
-    </w:p>
-    <w:p>
-      <w:pPr>
-        <w:rPr>
-          <w:b/>
-          <w:bCs/>
-          <w:sz w:val="40"/>
-          <w:szCs w:val="40"/>
-        </w:rPr>
-      </w:pPr>
-    </w:p>
-    <w:p>
-      <w:pPr>
-        <w:rPr>
-          <w:b/>
-          <w:bCs/>
-          <w:sz w:val="40"/>
-          <w:szCs w:val="40"/>
+        <w:spacing w:line="276" w:lineRule="auto"/>
+        <w:jc w:val="both"/>
+        <w:rPr>
+          <w:sz w:val="28"/>
+        </w:rPr>
+      </w:pPr>
+    </w:p>
+    <w:p>
+      <w:pPr>
+        <w:spacing w:line="276" w:lineRule="auto"/>
+        <w:jc w:val="both"/>
+        <w:rPr>
+          <w:sz w:val="28"/>
+        </w:rPr>
+      </w:pPr>
+    </w:p>
+    <w:p>
+      <w:pPr>
+        <w:spacing w:line="276" w:lineRule="auto"/>
+        <w:jc w:val="both"/>
+        <w:rPr>
+          <w:sz w:val="28"/>
         </w:rPr>
       </w:pPr>
     </w:p>
@@ -1300,267 +1505,18 @@
           <w:bCs/>
           <w:sz w:val="40"/>
           <w:szCs w:val="36"/>
-        </w:rPr>
-      </w:pPr>
-      <w:r>
-        <w:lastRenderedPageBreak/>
-        <w:tab/>
-      </w:r>
+          <w:lang w:val="en-US"/>
+        </w:rPr>
+      </w:pPr>
       <w:r>
         <w:rPr>
           <w:b/>
           <w:bCs/>
           <w:sz w:val="40"/>
           <w:szCs w:val="36"/>
-        </w:rPr>
-        <w:t>REFERAT</w:t>
-      </w:r>
-    </w:p>
-    <w:p>
-      <w:pPr>
-        <w:spacing w:line="276" w:lineRule="auto"/>
-        <w:jc w:val="center"/>
-        <w:rPr>
-          <w:b/>
-          <w:bCs/>
-          <w:szCs w:val="22"/>
-        </w:rPr>
-      </w:pPr>
-    </w:p>
-    <w:p>
-      <w:pPr>
-        <w:spacing w:line="276" w:lineRule="auto"/>
-        <w:jc w:val="both"/>
-        <w:rPr>
-          <w:sz w:val="28"/>
-        </w:rPr>
-      </w:pPr>
-      <w:r>
-        <w:rPr>
-          <w:sz w:val="28"/>
-        </w:rPr>
-        <w:t>İstehsalat təcrübəsi haqqında hesabat tələbənin əldə etdiyi nəzəri bilikləri, praktiki bacarıqları və təcrübəni komissiya qarşısında təqdim etmək məqsədi daşıyır. Hesabat giriş, iki əsas bölmə və nəticədən ibarətdir.</w:t>
-      </w:r>
-    </w:p>
-    <w:p>
-      <w:pPr>
-        <w:spacing w:line="276" w:lineRule="auto"/>
-        <w:jc w:val="both"/>
-        <w:rPr>
-          <w:sz w:val="28"/>
-        </w:rPr>
-      </w:pPr>
-    </w:p>
-    <w:p>
-      <w:pPr>
-        <w:spacing w:line="276" w:lineRule="auto"/>
-        <w:jc w:val="both"/>
-        <w:rPr>
-          <w:sz w:val="28"/>
-        </w:rPr>
-      </w:pPr>
-      <w:r>
-        <w:rPr>
-          <w:sz w:val="28"/>
-        </w:rPr>
-        <w:t>Giriş bölməsində təcrübənin keçirildiyi Aerokosmik Agentliyi haqqında ətraflı məlumat təqdim olunur. Agentlik kosmik və aerokosmik sahələrdə fəaliyyət göstərir, həmçinin təbii ehtiyatların tədqiqi ilə məşğul olur.</w:t>
-      </w:r>
-    </w:p>
-    <w:p>
-      <w:pPr>
-        <w:spacing w:line="276" w:lineRule="auto"/>
-        <w:jc w:val="both"/>
-        <w:rPr>
-          <w:sz w:val="28"/>
-        </w:rPr>
-      </w:pPr>
-    </w:p>
-    <w:p>
-      <w:pPr>
-        <w:spacing w:line="276" w:lineRule="auto"/>
-        <w:jc w:val="both"/>
-        <w:rPr>
-          <w:sz w:val="28"/>
-        </w:rPr>
-      </w:pPr>
-      <w:r>
-        <w:rPr>
-          <w:sz w:val="28"/>
-        </w:rPr>
-        <w:t>Hesabatın birinci bölməsində proqram təminatının yığılması sistemləri, onların xüsusiyyətləri və bir-birindən fərqləri müqayisəli şəkildə təsvir olunur. Bundan əlavə, proqram təminatının yığılması prosesində istifadə olunan proqramlar və texnologiyalar haqqında da məlumat verilir.</w:t>
-      </w:r>
-    </w:p>
-    <w:p>
-      <w:pPr>
-        <w:spacing w:line="276" w:lineRule="auto"/>
-        <w:jc w:val="both"/>
-        <w:rPr>
-          <w:sz w:val="28"/>
-        </w:rPr>
-      </w:pPr>
-    </w:p>
-    <w:p>
-      <w:pPr>
-        <w:spacing w:line="276" w:lineRule="auto"/>
-        <w:jc w:val="both"/>
-        <w:rPr>
-          <w:sz w:val="28"/>
-        </w:rPr>
-      </w:pPr>
-      <w:r>
-        <w:rPr>
-          <w:sz w:val="28"/>
-        </w:rPr>
-        <w:t>Hesabatın ikinci bölməsində əsas layihə – C++ proqramlaşdırma dilində hazırlanmış arxivləşdirmə proqramı təqdim olunur. Proqram faylları arxivə sıxışdırmağa və onları arxivdən çıxarmağa imkan verir. Layihə proqram təminatının yığılması sistemlərinin iş prinsipini və funksional imkanlarını müqayisə etmək üçün nümunə kimi istifadə olunur. Proqramın hazırlanma mərhələləri ətraflı şəkildə izah edilir və izahlı şəkillərlə müşayiət olunur. Həmçinin layihənin hazırlanması zamanı istifadə olunan proqram yığma sistemlərinin konfiqurasiyaları haqqında məlumat təqdim edilir.</w:t>
-      </w:r>
-    </w:p>
-    <w:p>
-      <w:pPr>
-        <w:spacing w:line="276" w:lineRule="auto"/>
-        <w:jc w:val="both"/>
-        <w:rPr>
-          <w:sz w:val="28"/>
-        </w:rPr>
-      </w:pPr>
-    </w:p>
-    <w:p>
-      <w:pPr>
-        <w:spacing w:line="276" w:lineRule="auto"/>
-        <w:jc w:val="both"/>
-        <w:rPr>
-          <w:sz w:val="28"/>
-        </w:rPr>
-      </w:pPr>
-      <w:r>
-        <w:rPr>
-          <w:sz w:val="28"/>
-        </w:rPr>
-        <w:t>Nəticə bölməsində təcrübə müddətində əldə olunan əsas texniki biliklər və praktiki bacarıqlar, eləcə də real iş mühiti ilə tanışlıq və layihə düşüncə tərzinin inkişafı vurğulanır.</w:t>
-      </w:r>
-    </w:p>
-    <w:p>
-      <w:pPr>
-        <w:spacing w:line="276" w:lineRule="auto"/>
-        <w:jc w:val="both"/>
-        <w:rPr>
-          <w:sz w:val="28"/>
-        </w:rPr>
-      </w:pPr>
-    </w:p>
-    <w:p>
-      <w:pPr>
-        <w:spacing w:line="276" w:lineRule="auto"/>
-        <w:jc w:val="both"/>
-        <w:rPr>
-          <w:sz w:val="28"/>
-        </w:rPr>
-      </w:pPr>
-    </w:p>
-    <w:p>
-      <w:pPr>
-        <w:spacing w:line="276" w:lineRule="auto"/>
-        <w:jc w:val="both"/>
-        <w:rPr>
-          <w:sz w:val="28"/>
-        </w:rPr>
-      </w:pPr>
-    </w:p>
-    <w:p>
-      <w:pPr>
-        <w:spacing w:line="276" w:lineRule="auto"/>
-        <w:jc w:val="both"/>
-        <w:rPr>
-          <w:sz w:val="28"/>
-        </w:rPr>
-      </w:pPr>
-    </w:p>
-    <w:p>
-      <w:pPr>
-        <w:spacing w:line="276" w:lineRule="auto"/>
-        <w:jc w:val="both"/>
-        <w:rPr>
-          <w:sz w:val="28"/>
-        </w:rPr>
-      </w:pPr>
-    </w:p>
-    <w:p>
-      <w:pPr>
-        <w:spacing w:line="276" w:lineRule="auto"/>
-        <w:jc w:val="both"/>
-        <w:rPr>
-          <w:sz w:val="28"/>
-        </w:rPr>
-      </w:pPr>
-    </w:p>
-    <w:p>
-      <w:pPr>
-        <w:spacing w:line="276" w:lineRule="auto"/>
-        <w:jc w:val="both"/>
-        <w:rPr>
-          <w:sz w:val="28"/>
-        </w:rPr>
-      </w:pPr>
-    </w:p>
-    <w:p>
-      <w:pPr>
-        <w:spacing w:line="276" w:lineRule="auto"/>
-        <w:jc w:val="both"/>
-        <w:rPr>
-          <w:sz w:val="28"/>
-        </w:rPr>
-      </w:pPr>
-    </w:p>
-    <w:p>
-      <w:pPr>
-        <w:spacing w:line="276" w:lineRule="auto"/>
-        <w:jc w:val="both"/>
-        <w:rPr>
-          <w:sz w:val="28"/>
-        </w:rPr>
-      </w:pPr>
-    </w:p>
-    <w:p>
-      <w:pPr>
-        <w:spacing w:line="276" w:lineRule="auto"/>
-        <w:jc w:val="both"/>
-        <w:rPr>
-          <w:sz w:val="28"/>
-        </w:rPr>
-      </w:pPr>
-    </w:p>
-    <w:p>
-      <w:pPr>
-        <w:spacing w:line="276" w:lineRule="auto"/>
-        <w:jc w:val="both"/>
-        <w:rPr>
-          <w:sz w:val="28"/>
-        </w:rPr>
-      </w:pPr>
-    </w:p>
-    <w:p>
-      <w:pPr>
-        <w:spacing w:line="276" w:lineRule="auto"/>
-        <w:jc w:val="center"/>
-        <w:rPr>
-          <w:b/>
-          <w:bCs/>
-          <w:sz w:val="40"/>
-          <w:szCs w:val="36"/>
-          <w:lang w:val="en-US"/>
-        </w:rPr>
-      </w:pPr>
-      <w:r>
+          <w:lang w:val="en-US"/>
+        </w:rPr>
         <w:lastRenderedPageBreak/>
-        <w:tab/>
-      </w:r>
-      <w:r>
-        <w:rPr>
-          <w:b/>
-          <w:bCs/>
-          <w:sz w:val="40"/>
-          <w:szCs w:val="36"/>
-          <w:lang w:val="en-US"/>
-        </w:rPr>
         <w:t>ABSTRACT</w:t>
       </w:r>
     </w:p>
@@ -4614,12 +4570,6 @@
       <w:pPr>
         <w:spacing w:after="160" w:line="259" w:lineRule="auto"/>
         <w:sectPr>
-          <w:headerReference w:type="even" r:id="rId10"/>
-          <w:headerReference w:type="default" r:id="rId11"/>
-          <w:footerReference w:type="even" r:id="rId12"/>
-          <w:footerReference w:type="default" r:id="rId13"/>
-          <w:headerReference w:type="first" r:id="rId14"/>
-          <w:footerReference w:type="first" r:id="rId15"/>
           <w:pgSz w:w="11906" w:h="16838"/>
           <w:pgMar w:top="1134" w:right="851" w:bottom="1134" w:left="1701" w:header="709" w:footer="709" w:gutter="0"/>
           <w:cols w:space="708"/>
@@ -4655,149 +4605,6 @@
     <w:p>
       <w:pPr>
         <w:spacing w:line="360" w:lineRule="auto"/>
-      </w:pPr>
-    </w:p>
-    <w:p>
-      <w:pPr>
-        <w:spacing w:line="360" w:lineRule="auto"/>
-        <w:jc w:val="both"/>
-        <w:rPr>
-          <w:sz w:val="28"/>
-          <w:szCs w:val="28"/>
-        </w:rPr>
-      </w:pPr>
-      <w:r>
-        <w:rPr>
-          <w:sz w:val="28"/>
-          <w:szCs w:val="28"/>
-        </w:rPr>
-        <w:t>Национальное Аэрокосмическое Агентство Азербайджана (Azərbaycan Milli Aerokosmik Agentliyi) представляет собой государственное аген</w:t>
-      </w:r>
-      <w:r>
-        <w:rPr>
-          <w:sz w:val="28"/>
-          <w:szCs w:val="28"/>
-        </w:rPr>
-        <w:t>т</w:t>
-      </w:r>
-      <w:r>
-        <w:rPr>
-          <w:sz w:val="28"/>
-          <w:szCs w:val="28"/>
-        </w:rPr>
-        <w:t>ство осуществляющее деятельность в таких областях как: аэрокосмические и космические программы и технологии, создание спутниковых систем, исследование природных ресурсов и т.д. Само аген</w:t>
-      </w:r>
-      <w:r>
-        <w:rPr>
-          <w:sz w:val="28"/>
-          <w:szCs w:val="28"/>
-        </w:rPr>
-        <w:t>т</w:t>
-      </w:r>
-      <w:r>
-        <w:rPr>
-          <w:sz w:val="28"/>
-          <w:szCs w:val="28"/>
-        </w:rPr>
-        <w:t xml:space="preserve">ство было образовано в 1992 году указом Аяза Муталлибова, но до этого существовало как научный центр «Каспий». </w:t>
-      </w:r>
-    </w:p>
-    <w:p>
-      <w:pPr>
-        <w:spacing w:line="360" w:lineRule="auto"/>
-        <w:jc w:val="both"/>
-        <w:rPr>
-          <w:sz w:val="28"/>
-          <w:szCs w:val="28"/>
-        </w:rPr>
-      </w:pPr>
-    </w:p>
-    <w:p>
-      <w:pPr>
-        <w:spacing w:line="360" w:lineRule="auto"/>
-        <w:jc w:val="both"/>
-        <w:rPr>
-          <w:sz w:val="28"/>
-          <w:szCs w:val="28"/>
-        </w:rPr>
-      </w:pPr>
-      <w:r>
-        <w:rPr>
-          <w:sz w:val="28"/>
-          <w:szCs w:val="28"/>
-        </w:rPr>
-        <w:t>Структура агентства состоит из самых разных подразделений, в</w:t>
-      </w:r>
-      <w:r>
-        <w:rPr>
-          <w:sz w:val="28"/>
-          <w:szCs w:val="28"/>
-        </w:rPr>
-        <w:t>ы</w:t>
-      </w:r>
-      <w:r>
-        <w:rPr>
-          <w:sz w:val="28"/>
-          <w:szCs w:val="28"/>
-        </w:rPr>
-        <w:t>числительных центров</w:t>
-      </w:r>
-      <w:r>
-        <w:rPr>
-          <w:sz w:val="28"/>
-          <w:szCs w:val="28"/>
-        </w:rPr>
-        <w:t>, лабораторий</w:t>
-      </w:r>
-      <w:r>
-        <w:rPr>
-          <w:sz w:val="28"/>
-          <w:szCs w:val="28"/>
-        </w:rPr>
-        <w:t xml:space="preserve"> и исследовательских институтов.</w:t>
-      </w:r>
-      <w:r>
-        <w:rPr>
-          <w:sz w:val="28"/>
-          <w:szCs w:val="28"/>
-        </w:rPr>
-        <w:t xml:space="preserve"> </w:t>
-      </w:r>
-      <w:r>
-        <w:rPr>
-          <w:sz w:val="28"/>
-          <w:szCs w:val="28"/>
-        </w:rPr>
-        <w:t>Именно за счет исследовательской деятельности и приборов Национального Аэрокосмического Агентства Азербайджана совместно с организацией Азеркосмос были запущены первые спутники Азербайджанской Республики</w:t>
-      </w:r>
-      <w:r>
-        <w:rPr>
-          <w:sz w:val="28"/>
-          <w:szCs w:val="28"/>
-        </w:rPr>
-        <w:t xml:space="preserve"> </w:t>
-      </w:r>
-      <w:r>
-        <w:rPr>
-          <w:sz w:val="28"/>
-          <w:szCs w:val="28"/>
-        </w:rPr>
-        <w:t>Azerspace-1 и Azerspace-2 с помощью американской Orbital Sciences Corporation, а также Asersky совместно с французским Airbus.</w:t>
-      </w:r>
-    </w:p>
-    <w:p>
-      <w:pPr>
-        <w:spacing w:line="360" w:lineRule="auto"/>
-        <w:jc w:val="both"/>
-        <w:rPr>
-          <w:sz w:val="28"/>
-          <w:szCs w:val="28"/>
-        </w:rPr>
-      </w:pPr>
-    </w:p>
-    <w:p>
-      <w:pPr>
-        <w:spacing w:line="360" w:lineRule="auto"/>
         <w:jc w:val="both"/>
         <w:rPr>
           <w:sz w:val="28"/>
@@ -4810,16 +4617,16 @@
           <w:szCs w:val="28"/>
         </w:rPr>
         <w:drawing>
-          <wp:anchor distT="0" distB="0" distL="114300" distR="114300" simplePos="0" relativeHeight="251660288" behindDoc="0" locked="0" layoutInCell="1" allowOverlap="1" wp14:anchorId="44264B8A" wp14:editId="5AC6C21C">
+          <wp:anchor distT="0" distB="0" distL="114300" distR="114300" simplePos="0" relativeHeight="251660288" behindDoc="0" locked="0" layoutInCell="1" allowOverlap="1" wp14:anchorId="44264B8A" wp14:editId="5E7E6C2F">
             <wp:simplePos x="0" y="0"/>
             <wp:positionH relativeFrom="margin">
-              <wp:align>center</wp:align>
+              <wp:posOffset>2433955</wp:posOffset>
             </wp:positionH>
             <wp:positionV relativeFrom="page">
-              <wp:posOffset>7795260</wp:posOffset>
+              <wp:posOffset>6141720</wp:posOffset>
             </wp:positionV>
-            <wp:extent cx="2525395" cy="2529840"/>
-            <wp:effectExtent l="0" t="0" r="8255" b="3810"/>
+            <wp:extent cx="1072515" cy="1074420"/>
+            <wp:effectExtent l="0" t="0" r="0" b="0"/>
             <wp:wrapTopAndBottom/>
             <wp:docPr id="1" name="Picture 1"/>
             <wp:cNvGraphicFramePr>
@@ -4835,7 +4642,7 @@
                     </pic:cNvPicPr>
                   </pic:nvPicPr>
                   <pic:blipFill>
-                    <a:blip r:embed="rId16">
+                    <a:blip r:embed="rId10" cstate="print">
                       <a:extLst>
                         <a:ext uri="{28A0092B-C50C-407E-A947-70E740481C1C}">
                           <a14:useLocalDpi xmlns:a14="http://schemas.microsoft.com/office/drawing/2010/main" val="0"/>
@@ -4850,7 +4657,7 @@
                   <pic:spPr bwMode="auto">
                     <a:xfrm>
                       <a:off x="0" y="0"/>
-                      <a:ext cx="2525395" cy="2529840"/>
+                      <a:ext cx="1072515" cy="1074420"/>
                     </a:xfrm>
                     <a:prstGeom prst="rect">
                       <a:avLst/>
@@ -4874,21 +4681,35 @@
           <w:sz w:val="28"/>
           <w:szCs w:val="28"/>
         </w:rPr>
-        <w:t>Аген</w:t>
-      </w:r>
-      <w:r>
-        <w:rPr>
-          <w:sz w:val="28"/>
-          <w:szCs w:val="28"/>
-        </w:rPr>
-        <w:t>т</w:t>
-      </w:r>
-      <w:r>
-        <w:rPr>
-          <w:sz w:val="28"/>
-          <w:szCs w:val="28"/>
-        </w:rPr>
-        <w:t>ство сотрудничает с такими крупными зарубежными компаниями как NASA, ESA, Роскосмос, космическими агентствами Израиля, Турции, Китая и Италии. Также с целью повышения квалификации местных кадров</w:t>
+        <w:t xml:space="preserve">Национальное Аэрокосмическое Агентство Азербайджана (Azərbaycan Milli Aerokosmik Agentliyi) представляет собой государственное учреждение, которое занимается аэрокосмическими и космическими программами и технологиями, разработкой спутниковых систем, исследованием природных ресурсов, а также другими направлениями. </w:t>
+      </w:r>
+      <w:r>
+        <w:rPr>
+          <w:sz w:val="28"/>
+          <w:szCs w:val="28"/>
+        </w:rPr>
+        <w:t>А</w:t>
+      </w:r>
+      <w:r>
+        <w:rPr>
+          <w:sz w:val="28"/>
+          <w:szCs w:val="28"/>
+        </w:rPr>
+        <w:t xml:space="preserve">гентство </w:t>
+      </w:r>
+      <w:r>
+        <w:rPr>
+          <w:sz w:val="28"/>
+          <w:szCs w:val="28"/>
+        </w:rPr>
+        <w:t>создано</w:t>
+      </w:r>
+      <w:r>
+        <w:rPr>
+          <w:sz w:val="28"/>
+          <w:szCs w:val="28"/>
+        </w:rPr>
+        <w:t xml:space="preserve"> в 1992 году</w:t>
       </w:r>
       <w:r>
         <w:rPr>
@@ -4902,41 +4723,42 @@
           <w:sz w:val="28"/>
           <w:szCs w:val="28"/>
         </w:rPr>
-        <w:t>проводятся специальные обучения в зарубежных странах как США, Франция и Россия.</w:t>
-      </w:r>
-    </w:p>
-    <w:p>
-      <w:pPr>
-        <w:spacing w:line="360" w:lineRule="auto"/>
-        <w:jc w:val="both"/>
-        <w:rPr>
-          <w:sz w:val="28"/>
-          <w:szCs w:val="28"/>
-        </w:rPr>
-      </w:pPr>
-    </w:p>
-    <w:p>
-      <w:pPr>
-        <w:spacing w:line="360" w:lineRule="auto"/>
-        <w:jc w:val="both"/>
-        <w:rPr>
-          <w:sz w:val="28"/>
-          <w:szCs w:val="28"/>
-        </w:rPr>
-      </w:pPr>
-      <w:r>
-        <w:rPr>
-          <w:sz w:val="28"/>
-          <w:szCs w:val="28"/>
-        </w:rPr>
-        <w:t xml:space="preserve">Производственная практика, проведённая в Национальном Аэрокосмическом Агентстве Азербайджана, была направлена на ознакомление с деятельностью агентства, а также на выполнение индивидуального задания </w:t>
-      </w:r>
-      <w:r>
-        <w:rPr>
-          <w:sz w:val="28"/>
-          <w:szCs w:val="28"/>
-        </w:rPr>
-        <w:t>–</w:t>
+        <w:t xml:space="preserve">указом Аяза Муталлибова, </w:t>
+      </w:r>
+      <w:r>
+        <w:rPr>
+          <w:sz w:val="28"/>
+          <w:szCs w:val="28"/>
+        </w:rPr>
+        <w:t>ранее оно функционировало</w:t>
+      </w:r>
+      <w:r>
+        <w:rPr>
+          <w:sz w:val="28"/>
+          <w:szCs w:val="28"/>
+        </w:rPr>
+        <w:t xml:space="preserve"> как научный центр «Каспий».</w:t>
+      </w:r>
+      <w:r>
+        <w:rPr>
+          <w:sz w:val="28"/>
+          <w:szCs w:val="28"/>
+        </w:rPr>
+        <w:t xml:space="preserve"> В с</w:t>
+      </w:r>
+      <w:r>
+        <w:rPr>
+          <w:sz w:val="28"/>
+          <w:szCs w:val="28"/>
+        </w:rPr>
+        <w:t>труктур</w:t>
+      </w:r>
+      <w:r>
+        <w:rPr>
+          <w:sz w:val="28"/>
+          <w:szCs w:val="28"/>
+        </w:rPr>
+        <w:t>у</w:t>
       </w:r>
       <w:r>
         <w:rPr>
@@ -4950,62 +4772,164 @@
           <w:sz w:val="28"/>
           <w:szCs w:val="28"/>
         </w:rPr>
-        <w:t>сравнительного анализа систем сборки современного программного обеспечения. Цель данной работы в создании различных систем сборки для специализированного программного обеспечения, используящегося в агенстве. Системы сборки занимают важную роль, ибо именно за счет них собирается программное обеспечение, создаваемое аген</w:t>
-      </w:r>
-      <w:r>
-        <w:rPr>
-          <w:sz w:val="28"/>
-          <w:szCs w:val="28"/>
-        </w:rPr>
-        <w:t>т</w:t>
-      </w:r>
-      <w:r>
-        <w:rPr>
-          <w:sz w:val="28"/>
-          <w:szCs w:val="28"/>
-        </w:rPr>
-        <w:t xml:space="preserve">ством на различных дистрибутивах GNU/Linux и ОС семейства Microsoft Windows. </w:t>
-      </w:r>
-    </w:p>
-    <w:p>
-      <w:pPr>
-        <w:spacing w:line="360" w:lineRule="auto"/>
-        <w:jc w:val="both"/>
-        <w:rPr>
-          <w:sz w:val="28"/>
-          <w:szCs w:val="28"/>
-        </w:rPr>
-      </w:pPr>
-    </w:p>
-    <w:p>
-      <w:pPr>
-        <w:spacing w:line="360" w:lineRule="auto"/>
-        <w:jc w:val="both"/>
-        <w:rPr>
-          <w:sz w:val="28"/>
-          <w:szCs w:val="28"/>
-        </w:rPr>
-      </w:pPr>
-      <w:r>
-        <w:rPr>
-          <w:sz w:val="28"/>
-          <w:szCs w:val="28"/>
-        </w:rPr>
-        <w:t>В процессе выполнения практического задания была проведенен сравнительный анализ существующих систем сборки и систем, создающих конфигурационные файлы для них. Для этого в практическое задание также входит небольшая программа</w:t>
-      </w:r>
-      <w:r>
-        <w:rPr>
-          <w:sz w:val="28"/>
-          <w:szCs w:val="28"/>
-        </w:rPr>
-        <w:t xml:space="preserve"> для архивации файлов</w:t>
-      </w:r>
-      <w:r>
-        <w:rPr>
-          <w:sz w:val="28"/>
-          <w:szCs w:val="28"/>
-        </w:rPr>
-        <w:t>, написанная на C++</w:t>
+        <w:t>агентства</w:t>
+      </w:r>
+      <w:r>
+        <w:rPr>
+          <w:sz w:val="28"/>
+          <w:szCs w:val="28"/>
+        </w:rPr>
+        <w:t xml:space="preserve"> входят </w:t>
+      </w:r>
+      <w:r>
+        <w:rPr>
+          <w:sz w:val="28"/>
+          <w:szCs w:val="28"/>
+        </w:rPr>
+        <w:t>вычислительны</w:t>
+      </w:r>
+      <w:r>
+        <w:rPr>
+          <w:sz w:val="28"/>
+          <w:szCs w:val="28"/>
+        </w:rPr>
+        <w:t>е</w:t>
+      </w:r>
+      <w:r>
+        <w:rPr>
+          <w:sz w:val="28"/>
+          <w:szCs w:val="28"/>
+        </w:rPr>
+        <w:t xml:space="preserve"> центр</w:t>
+      </w:r>
+      <w:r>
+        <w:rPr>
+          <w:sz w:val="28"/>
+          <w:szCs w:val="28"/>
+        </w:rPr>
+        <w:t>ы</w:t>
+      </w:r>
+      <w:r>
+        <w:rPr>
+          <w:sz w:val="28"/>
+          <w:szCs w:val="28"/>
+        </w:rPr>
+        <w:t>, лаборатори</w:t>
+      </w:r>
+      <w:r>
+        <w:rPr>
+          <w:sz w:val="28"/>
+          <w:szCs w:val="28"/>
+        </w:rPr>
+        <w:t>и</w:t>
+      </w:r>
+      <w:r>
+        <w:rPr>
+          <w:sz w:val="28"/>
+          <w:szCs w:val="28"/>
+        </w:rPr>
+        <w:t xml:space="preserve"> и исследовательски</w:t>
+      </w:r>
+      <w:r>
+        <w:rPr>
+          <w:sz w:val="28"/>
+          <w:szCs w:val="28"/>
+        </w:rPr>
+        <w:t>е</w:t>
+      </w:r>
+      <w:r>
+        <w:rPr>
+          <w:sz w:val="28"/>
+          <w:szCs w:val="28"/>
+        </w:rPr>
+        <w:t xml:space="preserve"> институ</w:t>
+      </w:r>
+      <w:r>
+        <w:rPr>
+          <w:sz w:val="28"/>
+          <w:szCs w:val="28"/>
+        </w:rPr>
+        <w:t>ты</w:t>
+      </w:r>
+      <w:r>
+        <w:rPr>
+          <w:sz w:val="28"/>
+          <w:szCs w:val="28"/>
+        </w:rPr>
+        <w:t xml:space="preserve">. Именно за счет исследовательской деятельности и приборов </w:t>
+      </w:r>
+      <w:r>
+        <w:rPr>
+          <w:sz w:val="28"/>
+          <w:szCs w:val="28"/>
+        </w:rPr>
+        <w:t>агенства</w:t>
+      </w:r>
+      <w:r>
+        <w:rPr>
+          <w:sz w:val="28"/>
+          <w:szCs w:val="28"/>
+        </w:rPr>
+        <w:t xml:space="preserve"> совместно с организацией Азеркосмос были запущены первые спутники Азербайджанской Республики Azerspace-1 и Azerspace-2 с помощью американской Orbital Sciences Corporation, а также Asersky совместно с французским Airbus. Агентство сотрудничает с такими крупными зарубежными компаниями как NASA, ESA, Роскосмос, космическими агентствами Израиля, Турции, Китая и Италии. Также с целью повышения квалификации местных кадров проводятся специальные обучения в зарубежных странах как США, Франция и Россия.</w:t>
+      </w:r>
+    </w:p>
+    <w:p>
+      <w:pPr>
+        <w:spacing w:line="360" w:lineRule="auto"/>
+        <w:jc w:val="both"/>
+        <w:rPr>
+          <w:sz w:val="28"/>
+          <w:szCs w:val="28"/>
+        </w:rPr>
+      </w:pPr>
+      <w:r>
+        <w:rPr>
+          <w:sz w:val="28"/>
+          <w:szCs w:val="28"/>
+        </w:rPr>
+        <w:t>Актуальность выбранной темы обусловлена тем, что в</w:t>
+      </w:r>
+      <w:r>
+        <w:rPr>
+          <w:sz w:val="28"/>
+          <w:szCs w:val="28"/>
+        </w:rPr>
+        <w:t xml:space="preserve"> </w:t>
+      </w:r>
+      <w:r>
+        <w:rPr>
+          <w:sz w:val="28"/>
+          <w:szCs w:val="28"/>
+        </w:rPr>
+        <w:t>аэрокосмическом и научном секторе качество и надёжность программного обеспечения играют критически важную роль.</w:t>
+      </w:r>
+      <w:r>
+        <w:rPr>
+          <w:sz w:val="28"/>
+          <w:szCs w:val="28"/>
+        </w:rPr>
+        <w:t xml:space="preserve"> </w:t>
+      </w:r>
+      <w:r>
+        <w:rPr>
+          <w:sz w:val="28"/>
+          <w:szCs w:val="28"/>
+        </w:rPr>
+        <w:t>Системы сборки ПО напрямую влияют на эффективность разработки и распространения специализированного</w:t>
+      </w:r>
+      <w:r>
+        <w:rPr>
+          <w:sz w:val="28"/>
+          <w:szCs w:val="28"/>
+        </w:rPr>
+        <w:t xml:space="preserve"> </w:t>
+      </w:r>
+      <w:r>
+        <w:rPr>
+          <w:sz w:val="28"/>
+          <w:szCs w:val="28"/>
+        </w:rPr>
+        <w:t>ПО</w:t>
       </w:r>
       <w:r>
         <w:rPr>
@@ -5019,54 +4943,6 @@
           <w:sz w:val="28"/>
           <w:szCs w:val="28"/>
         </w:rPr>
-        <w:t xml:space="preserve"> для которой и создаются системы сборки ПО.</w:t>
-      </w:r>
-    </w:p>
-    <w:p>
-      <w:pPr>
-        <w:spacing w:line="360" w:lineRule="auto"/>
-        <w:jc w:val="both"/>
-        <w:rPr>
-          <w:sz w:val="28"/>
-          <w:szCs w:val="28"/>
-        </w:rPr>
-      </w:pPr>
-    </w:p>
-    <w:p>
-      <w:pPr>
-        <w:spacing w:line="360" w:lineRule="auto"/>
-        <w:jc w:val="both"/>
-        <w:rPr>
-          <w:sz w:val="28"/>
-          <w:szCs w:val="28"/>
-        </w:rPr>
-      </w:pPr>
-      <w:r>
-        <w:rPr>
-          <w:sz w:val="28"/>
-          <w:szCs w:val="28"/>
-        </w:rPr>
-        <w:t>В данной работе использовались такие программы как GNU Make, C</w:t>
-      </w:r>
-      <w:r>
-        <w:rPr>
-          <w:sz w:val="28"/>
-          <w:szCs w:val="28"/>
-        </w:rPr>
-        <w:t>M</w:t>
-      </w:r>
-      <w:r>
-        <w:rPr>
-          <w:sz w:val="28"/>
-          <w:szCs w:val="28"/>
-        </w:rPr>
-        <w:t>ake, Meson, Ninja и GNU Autotools. Был создан идентичный функционал конфигурации для всех систем сборок</w:t>
-      </w:r>
-      <w:r>
-        <w:rPr>
-          <w:sz w:val="28"/>
-          <w:szCs w:val="28"/>
-        </w:rPr>
         <w:t xml:space="preserve"> </w:t>
       </w:r>
       <w:r>
@@ -5074,81 +4950,246 @@
           <w:sz w:val="28"/>
           <w:szCs w:val="28"/>
         </w:rPr>
-        <w:t>–</w:t>
-      </w:r>
-      <w:r>
-        <w:rPr>
-          <w:sz w:val="28"/>
-          <w:szCs w:val="28"/>
-        </w:rPr>
-        <w:t xml:space="preserve"> </w:t>
-      </w:r>
-      <w:r>
-        <w:rPr>
-          <w:sz w:val="28"/>
-          <w:szCs w:val="28"/>
-        </w:rPr>
-        <w:t>для наглядной демонстрации возможностей.</w:t>
-      </w:r>
-    </w:p>
-    <w:p>
-      <w:pPr>
-        <w:spacing w:line="360" w:lineRule="auto"/>
-        <w:jc w:val="both"/>
-        <w:rPr>
-          <w:sz w:val="28"/>
-          <w:szCs w:val="28"/>
-        </w:rPr>
-      </w:pPr>
-    </w:p>
-    <w:p>
-      <w:pPr>
-        <w:spacing w:line="360" w:lineRule="auto"/>
-        <w:jc w:val="both"/>
-        <w:rPr>
-          <w:sz w:val="28"/>
-          <w:szCs w:val="28"/>
-        </w:rPr>
-      </w:pPr>
-      <w:r>
-        <w:rPr>
-          <w:sz w:val="28"/>
-          <w:szCs w:val="28"/>
-        </w:rPr>
-        <w:t>Практика в Национальном Аэрокосмическом Агентстве Азербайджана позволила изучить внутреннее устройство организации и получить новую информацию про различные аэрокосмические, космические и наземные исследования, прозводимые аген</w:t>
-      </w:r>
-      <w:r>
-        <w:rPr>
-          <w:sz w:val="28"/>
-          <w:szCs w:val="28"/>
-        </w:rPr>
-        <w:t>т</w:t>
-      </w:r>
-      <w:r>
-        <w:rPr>
-          <w:sz w:val="28"/>
-          <w:szCs w:val="28"/>
-        </w:rPr>
-        <w:t>ством.</w:t>
-      </w:r>
-    </w:p>
-    <w:p>
-      <w:pPr>
-        <w:spacing w:line="360" w:lineRule="auto"/>
-        <w:rPr>
-          <w:sz w:val="28"/>
-          <w:szCs w:val="28"/>
-        </w:rPr>
-      </w:pPr>
-    </w:p>
-    <w:p>
-      <w:pPr>
-        <w:spacing w:line="360" w:lineRule="auto"/>
-        <w:rPr>
-          <w:sz w:val="28"/>
-          <w:szCs w:val="28"/>
-        </w:rPr>
-      </w:pPr>
+        <w:t>используе</w:t>
+      </w:r>
+      <w:r>
+        <w:rPr>
+          <w:sz w:val="28"/>
+          <w:szCs w:val="28"/>
+        </w:rPr>
+        <w:t>мого</w:t>
+      </w:r>
+      <w:r>
+        <w:rPr>
+          <w:sz w:val="28"/>
+          <w:szCs w:val="28"/>
+        </w:rPr>
+        <w:t xml:space="preserve"> в агентстве. В условиях работы на различных операционных системах, как например дистрибутивах GNU/Linux, правильная организация процесса сборки значительно ускоряет разработку, повышает кроссплатформенность и упрощает поддержку проектов. Изучение и сравнение современных систем сборки особо актуальн</w:t>
+      </w:r>
+      <w:r>
+        <w:rPr>
+          <w:sz w:val="28"/>
+          <w:szCs w:val="28"/>
+        </w:rPr>
+        <w:t>о</w:t>
+      </w:r>
+      <w:r>
+        <w:rPr>
+          <w:sz w:val="28"/>
+          <w:szCs w:val="28"/>
+        </w:rPr>
+        <w:t xml:space="preserve"> для государственных </w:t>
+      </w:r>
+      <w:r>
+        <w:rPr>
+          <w:sz w:val="28"/>
+          <w:szCs w:val="28"/>
+        </w:rPr>
+        <w:lastRenderedPageBreak/>
+        <w:t>научных организаций, где требуется высокая надёжность и воспроизводимость результатов.</w:t>
+      </w:r>
+    </w:p>
+    <w:p>
+      <w:pPr>
+        <w:spacing w:line="360" w:lineRule="auto"/>
+        <w:jc w:val="both"/>
+        <w:rPr>
+          <w:sz w:val="28"/>
+          <w:szCs w:val="28"/>
+        </w:rPr>
+      </w:pPr>
+    </w:p>
+    <w:p>
+      <w:pPr>
+        <w:spacing w:line="360" w:lineRule="auto"/>
+        <w:jc w:val="both"/>
+        <w:rPr>
+          <w:sz w:val="28"/>
+          <w:szCs w:val="28"/>
+        </w:rPr>
+      </w:pPr>
+      <w:r>
+        <w:rPr>
+          <w:sz w:val="28"/>
+          <w:szCs w:val="28"/>
+        </w:rPr>
+        <w:t xml:space="preserve">Целью данной работы было создание и сравнительный анализ различных систем сборки для </w:t>
+      </w:r>
+      <w:r>
+        <w:rPr>
+          <w:sz w:val="28"/>
+          <w:szCs w:val="28"/>
+        </w:rPr>
+        <w:t>современного</w:t>
+      </w:r>
+      <w:r>
+        <w:rPr>
+          <w:sz w:val="28"/>
+          <w:szCs w:val="28"/>
+        </w:rPr>
+        <w:t xml:space="preserve"> программного обеспечения. В рамках практики была разработана полноценная конфигурация для сборки тестового проекта – небольшой программы архивации файлов на языке </w:t>
+      </w:r>
+      <w:r>
+        <w:rPr>
+          <w:sz w:val="28"/>
+          <w:szCs w:val="28"/>
+          <w:lang w:val="en-US"/>
+        </w:rPr>
+        <w:t>C</w:t>
+      </w:r>
+      <w:r>
+        <w:rPr>
+          <w:sz w:val="28"/>
+          <w:szCs w:val="28"/>
+        </w:rPr>
+        <w:t>++. Для наглядности был реализован идентичный функционал конфигурации в разных системах сборки: CMake, Meson, и GNU Autotools</w:t>
+      </w:r>
+      <w:r>
+        <w:rPr>
+          <w:sz w:val="28"/>
+          <w:szCs w:val="28"/>
+        </w:rPr>
+        <w:t xml:space="preserve">. </w:t>
+      </w:r>
+      <w:r>
+        <w:rPr>
+          <w:sz w:val="28"/>
+          <w:szCs w:val="28"/>
+        </w:rPr>
+        <w:t>Это позволило продемонстрировать возможности каждой системы, их сильные и слабые стороны, удобство использования и особенности работы с кроссплатформенными проектами.</w:t>
+      </w:r>
+    </w:p>
+    <w:p>
+      <w:pPr>
+        <w:spacing w:line="360" w:lineRule="auto"/>
+        <w:jc w:val="both"/>
+        <w:rPr>
+          <w:sz w:val="28"/>
+          <w:szCs w:val="28"/>
+        </w:rPr>
+      </w:pPr>
+    </w:p>
+    <w:p>
+      <w:pPr>
+        <w:spacing w:line="360" w:lineRule="auto"/>
+        <w:jc w:val="both"/>
+        <w:rPr>
+          <w:sz w:val="28"/>
+          <w:szCs w:val="28"/>
+        </w:rPr>
+      </w:pPr>
+      <w:r>
+        <w:rPr>
+          <w:sz w:val="28"/>
+          <w:szCs w:val="28"/>
+        </w:rPr>
+        <w:t xml:space="preserve">Для достижения поставленных целей были решены следующие задачи: проведён сравнительный анализ существующих систем сборки и инструментов, создающих для них конфигурационные файлы; изучены принципы работы выбранных инструментов; разработаны рабочие конфигурационные файлы для всех упомянутых систем сборки применительно к одной и той же программе на </w:t>
+      </w:r>
+      <w:r>
+        <w:rPr>
+          <w:sz w:val="28"/>
+          <w:szCs w:val="28"/>
+          <w:lang w:val="en-US"/>
+        </w:rPr>
+        <w:t>C</w:t>
+      </w:r>
+      <w:r>
+        <w:rPr>
+          <w:sz w:val="28"/>
+          <w:szCs w:val="28"/>
+        </w:rPr>
+        <w:t>++</w:t>
+      </w:r>
+      <w:r>
+        <w:rPr>
+          <w:sz w:val="28"/>
+          <w:szCs w:val="28"/>
+        </w:rPr>
+        <w:t>; подготовлены материалы, демонстрирующие различия в скорости</w:t>
+      </w:r>
+      <w:r>
+        <w:rPr>
+          <w:sz w:val="28"/>
+          <w:szCs w:val="28"/>
+        </w:rPr>
+        <w:t xml:space="preserve"> и гибкости</w:t>
+      </w:r>
+      <w:r>
+        <w:rPr>
+          <w:sz w:val="28"/>
+          <w:szCs w:val="28"/>
+        </w:rPr>
+        <w:t xml:space="preserve"> систем.</w:t>
+      </w:r>
+    </w:p>
+    <w:p>
+      <w:pPr>
+        <w:spacing w:line="360" w:lineRule="auto"/>
+        <w:jc w:val="both"/>
+        <w:rPr>
+          <w:sz w:val="28"/>
+          <w:szCs w:val="28"/>
+        </w:rPr>
+      </w:pPr>
+    </w:p>
+    <w:p>
+      <w:pPr>
+        <w:spacing w:line="360" w:lineRule="auto"/>
+        <w:jc w:val="both"/>
+        <w:rPr>
+          <w:sz w:val="28"/>
+          <w:szCs w:val="28"/>
+        </w:rPr>
+      </w:pPr>
+      <w:r>
+        <w:rPr>
+          <w:sz w:val="28"/>
+          <w:szCs w:val="28"/>
+        </w:rPr>
+        <w:t xml:space="preserve">В результате выполнения практики удалось успешно создать три системы сборки для программы архивации файлов на </w:t>
+      </w:r>
+      <w:r>
+        <w:rPr>
+          <w:sz w:val="28"/>
+          <w:szCs w:val="28"/>
+          <w:lang w:val="en-US"/>
+        </w:rPr>
+        <w:t>C</w:t>
+      </w:r>
+      <w:r>
+        <w:rPr>
+          <w:sz w:val="28"/>
+          <w:szCs w:val="28"/>
+        </w:rPr>
+        <w:t>++. Были получены полностью функциональные конфигурационные файлы, обеспечивающие одинаковый между собой результат сборки.</w:t>
+      </w:r>
+    </w:p>
+    <w:p>
+      <w:pPr>
+        <w:spacing w:line="360" w:lineRule="auto"/>
+        <w:jc w:val="both"/>
+        <w:rPr>
+          <w:sz w:val="28"/>
+          <w:szCs w:val="28"/>
+        </w:rPr>
+      </w:pPr>
+    </w:p>
+    <w:p>
+      <w:pPr>
+        <w:spacing w:line="360" w:lineRule="auto"/>
+        <w:jc w:val="both"/>
+        <w:rPr>
+          <w:sz w:val="28"/>
+          <w:szCs w:val="28"/>
+        </w:rPr>
+      </w:pPr>
+      <w:r>
+        <w:rPr>
+          <w:sz w:val="28"/>
+          <w:szCs w:val="28"/>
+        </w:rPr>
+        <w:t>Практика в Национальном Аэрокосмическом Агентстве Азербайджана позволила изучить внутреннее устройство организации и получить новую информацию про различные аэрокосмические, космические и наземные исследования, проводимые агентством.</w:t>
+      </w:r>
     </w:p>
     <w:p>
       <w:pPr>
@@ -19521,7 +19562,7 @@
                     </pic:cNvPicPr>
                   </pic:nvPicPr>
                   <pic:blipFill>
-                    <a:blip r:embed="rId17"/>
+                    <a:blip r:embed="rId11"/>
                     <a:stretch>
                       <a:fillRect/>
                     </a:stretch>
@@ -19770,7 +19811,7 @@
                     </pic:cNvPicPr>
                   </pic:nvPicPr>
                   <pic:blipFill>
-                    <a:blip r:embed="rId18"/>
+                    <a:blip r:embed="rId12"/>
                     <a:stretch>
                       <a:fillRect/>
                     </a:stretch>
@@ -20788,7 +20829,7 @@
                     </pic:cNvPicPr>
                   </pic:nvPicPr>
                   <pic:blipFill>
-                    <a:blip r:embed="rId19"/>
+                    <a:blip r:embed="rId13"/>
                     <a:stretch>
                       <a:fillRect/>
                     </a:stretch>
@@ -20967,7 +21008,7 @@
                     </pic:cNvPicPr>
                   </pic:nvPicPr>
                   <pic:blipFill>
-                    <a:blip r:embed="rId20"/>
+                    <a:blip r:embed="rId14"/>
                     <a:stretch>
                       <a:fillRect/>
                     </a:stretch>
@@ -24010,7 +24051,7 @@
                     </pic:cNvPicPr>
                   </pic:nvPicPr>
                   <pic:blipFill>
-                    <a:blip r:embed="rId21"/>
+                    <a:blip r:embed="rId15"/>
                     <a:stretch>
                       <a:fillRect/>
                     </a:stretch>
@@ -24267,7 +24308,7 @@
                     </pic:cNvPicPr>
                   </pic:nvPicPr>
                   <pic:blipFill>
-                    <a:blip r:embed="rId22"/>
+                    <a:blip r:embed="rId16"/>
                     <a:stretch>
                       <a:fillRect/>
                     </a:stretch>
@@ -24461,7 +24502,7 @@
                     </pic:cNvPicPr>
                   </pic:nvPicPr>
                   <pic:blipFill>
-                    <a:blip r:embed="rId23"/>
+                    <a:blip r:embed="rId17"/>
                     <a:stretch>
                       <a:fillRect/>
                     </a:stretch>
@@ -26705,7 +26746,7 @@
                     </pic:cNvPicPr>
                   </pic:nvPicPr>
                   <pic:blipFill>
-                    <a:blip r:embed="rId24"/>
+                    <a:blip r:embed="rId18"/>
                     <a:stretch>
                       <a:fillRect/>
                     </a:stretch>
@@ -28512,7 +28553,7 @@
                     </pic:cNvPicPr>
                   </pic:nvPicPr>
                   <pic:blipFill>
-                    <a:blip r:embed="rId25"/>
+                    <a:blip r:embed="rId19"/>
                     <a:stretch>
                       <a:fillRect/>
                     </a:stretch>
@@ -29970,7 +30011,7 @@
                     </pic:cNvPicPr>
                   </pic:nvPicPr>
                   <pic:blipFill>
-                    <a:blip r:embed="rId26"/>
+                    <a:blip r:embed="rId20"/>
                     <a:stretch>
                       <a:fillRect/>
                     </a:stretch>
@@ -31089,7 +31130,7 @@
                     </pic:cNvPicPr>
                   </pic:nvPicPr>
                   <pic:blipFill>
-                    <a:blip r:embed="rId27"/>
+                    <a:blip r:embed="rId21"/>
                     <a:stretch>
                       <a:fillRect/>
                     </a:stretch>
@@ -31848,7 +31889,7 @@
                     </pic:cNvPicPr>
                   </pic:nvPicPr>
                   <pic:blipFill>
-                    <a:blip r:embed="rId28"/>
+                    <a:blip r:embed="rId22"/>
                     <a:stretch>
                       <a:fillRect/>
                     </a:stretch>
@@ -32804,7 +32845,7 @@
                     </pic:cNvPicPr>
                   </pic:nvPicPr>
                   <pic:blipFill>
-                    <a:blip r:embed="rId29"/>
+                    <a:blip r:embed="rId23"/>
                     <a:stretch>
                       <a:fillRect/>
                     </a:stretch>
@@ -34577,7 +34618,7 @@
           <w:szCs w:val="28"/>
         </w:rPr>
       </w:pPr>
-      <w:hyperlink r:id="rId30">
+      <w:hyperlink r:id="rId24">
         <w:r>
           <w:rPr>
             <w:rStyle w:val="Hyperlink"/>
@@ -34709,7 +34750,7 @@
                     </pic:cNvPicPr>
                   </pic:nvPicPr>
                   <pic:blipFill>
-                    <a:blip r:embed="rId31"/>
+                    <a:blip r:embed="rId25"/>
                     <a:stretch>
                       <a:fillRect/>
                     </a:stretch>
@@ -35462,7 +35503,7 @@
         </w:rPr>
         <w:t xml:space="preserve"> </w:t>
       </w:r>
-      <w:hyperlink r:id="rId32" w:history="1">
+      <w:hyperlink r:id="rId26" w:history="1">
         <w:r>
           <w:rPr>
             <w:rStyle w:val="Hyperlink"/>
@@ -35512,7 +35553,7 @@
           <w:szCs w:val="28"/>
         </w:rPr>
       </w:pPr>
-      <w:hyperlink r:id="rId33" w:history="1">
+      <w:hyperlink r:id="rId27" w:history="1">
         <w:r>
           <w:rPr>
             <w:rStyle w:val="Hyperlink"/>
@@ -35544,7 +35585,7 @@
       <w:r>
         <w:t xml:space="preserve"> </w:t>
       </w:r>
-      <w:hyperlink r:id="rId34" w:history="1">
+      <w:hyperlink r:id="rId28" w:history="1">
         <w:r>
           <w:rPr>
             <w:rStyle w:val="Hyperlink"/>
@@ -35575,7 +35616,7 @@
       <w:r>
         <w:t xml:space="preserve"> </w:t>
       </w:r>
-      <w:hyperlink r:id="rId35" w:history="1">
+      <w:hyperlink r:id="rId29" w:history="1">
         <w:r>
           <w:rPr>
             <w:rStyle w:val="Hyperlink"/>
@@ -35605,7 +35646,7 @@
       <w:r>
         <w:t xml:space="preserve"> </w:t>
       </w:r>
-      <w:hyperlink r:id="rId36" w:history="1">
+      <w:hyperlink r:id="rId30" w:history="1">
         <w:r>
           <w:rPr>
             <w:rStyle w:val="Hyperlink"/>
@@ -35640,7 +35681,7 @@
         </w:rPr>
         <w:t xml:space="preserve"> </w:t>
       </w:r>
-      <w:hyperlink r:id="rId37" w:history="1">
+      <w:hyperlink r:id="rId31" w:history="1">
         <w:r>
           <w:rPr>
             <w:rStyle w:val="Hyperlink"/>
@@ -35675,7 +35716,7 @@
         </w:rPr>
         <w:t xml:space="preserve"> </w:t>
       </w:r>
-      <w:hyperlink r:id="rId38" w:history="1">
+      <w:hyperlink r:id="rId32" w:history="1">
         <w:r>
           <w:rPr>
             <w:rStyle w:val="Hyperlink"/>
@@ -35710,7 +35751,7 @@
         </w:rPr>
         <w:t xml:space="preserve"> </w:t>
       </w:r>
-      <w:hyperlink r:id="rId39" w:history="1">
+      <w:hyperlink r:id="rId33" w:history="1">
         <w:r>
           <w:rPr>
             <w:rStyle w:val="Hyperlink"/>
@@ -35745,7 +35786,7 @@
         </w:rPr>
         <w:t xml:space="preserve"> </w:t>
       </w:r>
-      <w:hyperlink r:id="rId40" w:history="1">
+      <w:hyperlink r:id="rId34" w:history="1">
         <w:r>
           <w:rPr>
             <w:rStyle w:val="Hyperlink"/>
@@ -35780,7 +35821,7 @@
         </w:rPr>
         <w:t xml:space="preserve"> </w:t>
       </w:r>
-      <w:hyperlink r:id="rId41" w:history="1">
+      <w:hyperlink r:id="rId35" w:history="1">
         <w:r>
           <w:rPr>
             <w:rStyle w:val="Hyperlink"/>
@@ -35815,7 +35856,7 @@
         </w:rPr>
         <w:t xml:space="preserve"> </w:t>
       </w:r>
-      <w:hyperlink r:id="rId42" w:history="1">
+      <w:hyperlink r:id="rId36" w:history="1">
         <w:r>
           <w:rPr>
             <w:rStyle w:val="Hyperlink"/>
@@ -35938,7 +35979,7 @@
           <w:szCs w:val="28"/>
         </w:rPr>
       </w:pPr>
-      <w:hyperlink r:id="rId43" w:history="1">
+      <w:hyperlink r:id="rId37" w:history="1">
         <w:r>
           <w:rPr>
             <w:rStyle w:val="Hyperlink"/>
@@ -35962,7 +36003,7 @@
       </w:pPr>
     </w:p>
     <w:sectPr>
-      <w:footerReference w:type="default" r:id="rId44"/>
+      <w:footerReference w:type="default" r:id="rId38"/>
       <w:pgSz w:w="11906" w:h="16838"/>
       <w:pgMar w:top="1134" w:right="851" w:bottom="1134" w:left="1701" w:header="709" w:footer="709" w:gutter="0"/>
       <w:cols w:space="708"/>
@@ -35989,6 +36030,9 @@
     <w:p/>
     <w:p/>
     <w:p/>
+    <w:p/>
+    <w:p/>
+    <w:p/>
   </w:endnote>
   <w:endnote w:type="continuationSeparator" w:id="0">
     <w:p>
@@ -35996,6 +36040,9 @@
         <w:continuationSeparator/>
       </w:r>
     </w:p>
+    <w:p/>
+    <w:p/>
+    <w:p/>
     <w:p/>
     <w:p/>
     <w:p/>
@@ -36010,36 +36057,6 @@
 </file>
 
 <file path=word/footer1.xml><?xml version="1.0" encoding="utf-8"?>
-<w:ftr xmlns:wpc="http://schemas.microsoft.com/office/word/2010/wordprocessingCanvas" xmlns:cx="http://schemas.microsoft.com/office/drawing/2014/chartex" xmlns:cx1="http://schemas.microsoft.com/office/drawing/2015/9/8/chartex" xmlns:cx2="http://schemas.microsoft.com/office/drawing/2015/10/21/chartex" xmlns:cx3="http://schemas.microsoft.com/office/drawing/2016/5/9/chartex" xmlns:cx4="http://schemas.microsoft.com/office/drawing/2016/5/10/chartex" xmlns:cx5="http://schemas.microsoft.com/office/drawing/2016/5/11/chartex" xmlns:cx6="http://schemas.microsoft.com/office/drawing/2016/5/12/chartex" xmlns:cx7="http://schemas.microsoft.com/office/drawing/2016/5/13/chartex" xmlns:cx8="http://schemas.microsoft.com/office/drawing/2016/5/14/chartex" xmlns:mc="http://schemas.openxmlformats.org/markup-compatibility/2006" xmlns:aink="http://schemas.microsoft.com/office/drawing/2016/ink" xmlns:am3d="http://schemas.microsoft.com/office/drawing/2017/model3d" xmlns:o="urn:schemas-microsoft-com:office:office" xmlns:r="http://schemas.openxmlformats.org/officeDocument/2006/relationships" xmlns:m="http://schemas.openxmlformats.org/officeDocument/2006/math" xmlns:v="urn:schemas-microsoft-com:vml" xmlns:wp14="http://schemas.microsoft.com/office/word/2010/wordprocessingDrawing" xmlns:wp="http://schemas.openxmlformats.org/drawingml/2006/wordprocessingDrawing" xmlns:w10="urn:schemas-microsoft-com:office:word" xmlns:w="http://schemas.openxmlformats.org/wordprocessingml/2006/main" xmlns:w14="http://schemas.microsoft.com/office/word/2010/wordml" xmlns:w15="http://schemas.microsoft.com/office/word/2012/wordml" xmlns:w16cex="http://schemas.microsoft.com/office/word/2018/wordml/cex" xmlns:w16cid="http://schemas.microsoft.com/office/word/2016/wordml/cid" xmlns:w16="http://schemas.microsoft.com/office/word/2018/wordml" xmlns:w16sdtdh="http://schemas.microsoft.com/office/word/2020/wordml/sdtdatahash" xmlns:w16se="http://schemas.microsoft.com/office/word/2015/wordml/symex" xmlns:wpg="http://schemas.microsoft.com/office/word/2010/wordprocessingGroup" xmlns:wpi="http://schemas.microsoft.com/office/word/2010/wordprocessingInk" xmlns:wne="http://schemas.microsoft.com/office/word/2006/wordml" xmlns:wps="http://schemas.microsoft.com/office/word/2010/wordprocessingShape" mc:Ignorable="w14 w15 w16se w16cid w16 w16cex w16sdtdh wp14">
-  <w:p>
-    <w:pPr>
-      <w:pStyle w:val="Footer"/>
-    </w:pPr>
-  </w:p>
-</w:ftr>
-</file>
-
-<file path=word/footer2.xml><?xml version="1.0" encoding="utf-8"?>
-<w:ftr xmlns:wpc="http://schemas.microsoft.com/office/word/2010/wordprocessingCanvas" xmlns:cx="http://schemas.microsoft.com/office/drawing/2014/chartex" xmlns:cx1="http://schemas.microsoft.com/office/drawing/2015/9/8/chartex" xmlns:cx2="http://schemas.microsoft.com/office/drawing/2015/10/21/chartex" xmlns:cx3="http://schemas.microsoft.com/office/drawing/2016/5/9/chartex" xmlns:cx4="http://schemas.microsoft.com/office/drawing/2016/5/10/chartex" xmlns:cx5="http://schemas.microsoft.com/office/drawing/2016/5/11/chartex" xmlns:cx6="http://schemas.microsoft.com/office/drawing/2016/5/12/chartex" xmlns:cx7="http://schemas.microsoft.com/office/drawing/2016/5/13/chartex" xmlns:cx8="http://schemas.microsoft.com/office/drawing/2016/5/14/chartex" xmlns:mc="http://schemas.openxmlformats.org/markup-compatibility/2006" xmlns:aink="http://schemas.microsoft.com/office/drawing/2016/ink" xmlns:am3d="http://schemas.microsoft.com/office/drawing/2017/model3d" xmlns:o="urn:schemas-microsoft-com:office:office" xmlns:r="http://schemas.openxmlformats.org/officeDocument/2006/relationships" xmlns:m="http://schemas.openxmlformats.org/officeDocument/2006/math" xmlns:v="urn:schemas-microsoft-com:vml" xmlns:wp14="http://schemas.microsoft.com/office/word/2010/wordprocessingDrawing" xmlns:wp="http://schemas.openxmlformats.org/drawingml/2006/wordprocessingDrawing" xmlns:w10="urn:schemas-microsoft-com:office:word" xmlns:w="http://schemas.openxmlformats.org/wordprocessingml/2006/main" xmlns:w14="http://schemas.microsoft.com/office/word/2010/wordml" xmlns:w15="http://schemas.microsoft.com/office/word/2012/wordml" xmlns:w16cex="http://schemas.microsoft.com/office/word/2018/wordml/cex" xmlns:w16cid="http://schemas.microsoft.com/office/word/2016/wordml/cid" xmlns:w16="http://schemas.microsoft.com/office/word/2018/wordml" xmlns:w16sdtdh="http://schemas.microsoft.com/office/word/2020/wordml/sdtdatahash" xmlns:w16se="http://schemas.microsoft.com/office/word/2015/wordml/symex" xmlns:wpg="http://schemas.microsoft.com/office/word/2010/wordprocessingGroup" xmlns:wpi="http://schemas.microsoft.com/office/word/2010/wordprocessingInk" xmlns:wne="http://schemas.microsoft.com/office/word/2006/wordml" xmlns:wps="http://schemas.microsoft.com/office/word/2010/wordprocessingShape" mc:Ignorable="w14 w15 w16se w16cid w16 w16cex w16sdtdh wp14">
-  <w:p>
-    <w:pPr>
-      <w:pStyle w:val="Footer"/>
-    </w:pPr>
-  </w:p>
-</w:ftr>
-</file>
-
-<file path=word/footer3.xml><?xml version="1.0" encoding="utf-8"?>
-<w:ftr xmlns:wpc="http://schemas.microsoft.com/office/word/2010/wordprocessingCanvas" xmlns:cx="http://schemas.microsoft.com/office/drawing/2014/chartex" xmlns:cx1="http://schemas.microsoft.com/office/drawing/2015/9/8/chartex" xmlns:cx2="http://schemas.microsoft.com/office/drawing/2015/10/21/chartex" xmlns:cx3="http://schemas.microsoft.com/office/drawing/2016/5/9/chartex" xmlns:cx4="http://schemas.microsoft.com/office/drawing/2016/5/10/chartex" xmlns:cx5="http://schemas.microsoft.com/office/drawing/2016/5/11/chartex" xmlns:cx6="http://schemas.microsoft.com/office/drawing/2016/5/12/chartex" xmlns:cx7="http://schemas.microsoft.com/office/drawing/2016/5/13/chartex" xmlns:cx8="http://schemas.microsoft.com/office/drawing/2016/5/14/chartex" xmlns:mc="http://schemas.openxmlformats.org/markup-compatibility/2006" xmlns:aink="http://schemas.microsoft.com/office/drawing/2016/ink" xmlns:am3d="http://schemas.microsoft.com/office/drawing/2017/model3d" xmlns:o="urn:schemas-microsoft-com:office:office" xmlns:r="http://schemas.openxmlformats.org/officeDocument/2006/relationships" xmlns:m="http://schemas.openxmlformats.org/officeDocument/2006/math" xmlns:v="urn:schemas-microsoft-com:vml" xmlns:wp14="http://schemas.microsoft.com/office/word/2010/wordprocessingDrawing" xmlns:wp="http://schemas.openxmlformats.org/drawingml/2006/wordprocessingDrawing" xmlns:w10="urn:schemas-microsoft-com:office:word" xmlns:w="http://schemas.openxmlformats.org/wordprocessingml/2006/main" xmlns:w14="http://schemas.microsoft.com/office/word/2010/wordml" xmlns:w15="http://schemas.microsoft.com/office/word/2012/wordml" xmlns:w16cex="http://schemas.microsoft.com/office/word/2018/wordml/cex" xmlns:w16cid="http://schemas.microsoft.com/office/word/2016/wordml/cid" xmlns:w16="http://schemas.microsoft.com/office/word/2018/wordml" xmlns:w16sdtdh="http://schemas.microsoft.com/office/word/2020/wordml/sdtdatahash" xmlns:w16se="http://schemas.microsoft.com/office/word/2015/wordml/symex" xmlns:wpg="http://schemas.microsoft.com/office/word/2010/wordprocessingGroup" xmlns:wpi="http://schemas.microsoft.com/office/word/2010/wordprocessingInk" xmlns:wne="http://schemas.microsoft.com/office/word/2006/wordml" xmlns:wps="http://schemas.microsoft.com/office/word/2010/wordprocessingShape" mc:Ignorable="w14 w15 w16se w16cid w16 w16cex w16sdtdh wp14">
-  <w:p>
-    <w:pPr>
-      <w:pStyle w:val="Footer"/>
-    </w:pPr>
-  </w:p>
-</w:ftr>
-</file>
-
-<file path=word/footer4.xml><?xml version="1.0" encoding="utf-8"?>
 <w:ftr xmlns:wpc="http://schemas.microsoft.com/office/word/2010/wordprocessingCanvas" xmlns:cx="http://schemas.microsoft.com/office/drawing/2014/chartex" xmlns:cx1="http://schemas.microsoft.com/office/drawing/2015/9/8/chartex" xmlns:cx2="http://schemas.microsoft.com/office/drawing/2015/10/21/chartex" xmlns:cx3="http://schemas.microsoft.com/office/drawing/2016/5/9/chartex" xmlns:cx4="http://schemas.microsoft.com/office/drawing/2016/5/10/chartex" xmlns:cx5="http://schemas.microsoft.com/office/drawing/2016/5/11/chartex" xmlns:cx6="http://schemas.microsoft.com/office/drawing/2016/5/12/chartex" xmlns:cx7="http://schemas.microsoft.com/office/drawing/2016/5/13/chartex" xmlns:cx8="http://schemas.microsoft.com/office/drawing/2016/5/14/chartex" xmlns:mc="http://schemas.openxmlformats.org/markup-compatibility/2006" xmlns:aink="http://schemas.microsoft.com/office/drawing/2016/ink" xmlns:am3d="http://schemas.microsoft.com/office/drawing/2017/model3d" xmlns:o="urn:schemas-microsoft-com:office:office" xmlns:r="http://schemas.openxmlformats.org/officeDocument/2006/relationships" xmlns:m="http://schemas.openxmlformats.org/officeDocument/2006/math" xmlns:v="urn:schemas-microsoft-com:vml" xmlns:wp14="http://schemas.microsoft.com/office/word/2010/wordprocessingDrawing" xmlns:wp="http://schemas.openxmlformats.org/drawingml/2006/wordprocessingDrawing" xmlns:w10="urn:schemas-microsoft-com:office:word" xmlns:w="http://schemas.openxmlformats.org/wordprocessingml/2006/main" xmlns:w14="http://schemas.microsoft.com/office/word/2010/wordml" xmlns:w15="http://schemas.microsoft.com/office/word/2012/wordml" xmlns:w16cex="http://schemas.microsoft.com/office/word/2018/wordml/cex" xmlns:w16cid="http://schemas.microsoft.com/office/word/2016/wordml/cid" xmlns:w16="http://schemas.microsoft.com/office/word/2018/wordml" xmlns:w16sdtdh="http://schemas.microsoft.com/office/word/2020/wordml/sdtdatahash" xmlns:w16se="http://schemas.microsoft.com/office/word/2015/wordml/symex" xmlns:wpg="http://schemas.microsoft.com/office/word/2010/wordprocessingGroup" xmlns:wpi="http://schemas.microsoft.com/office/word/2010/wordprocessingInk" xmlns:wne="http://schemas.microsoft.com/office/word/2006/wordml" xmlns:wps="http://schemas.microsoft.com/office/word/2010/wordprocessingShape" mc:Ignorable="w14 w15 w16se w16cid w16 w16cex w16sdtdh wp14">
   <w:sdt>
     <w:sdtPr>
@@ -36095,9 +36112,17 @@
           <w:fldChar w:fldCharType="end"/>
         </w:r>
       </w:p>
+      <w:p>
+        <w:pPr>
+          <w:pStyle w:val="Footer"/>
+          <w:jc w:val="right"/>
+          <w:rPr>
+            <w:color w:val="000000" w:themeColor="text1"/>
+          </w:rPr>
+        </w:pPr>
+      </w:p>
     </w:sdtContent>
   </w:sdt>
-  <w:p/>
 </w:ftr>
 </file>
 
@@ -36109,6 +36134,9 @@
         <w:separator/>
       </w:r>
     </w:p>
+    <w:p/>
+    <w:p/>
+    <w:p/>
     <w:p/>
     <w:p/>
     <w:p/>
@@ -36134,38 +36162,11 @@
     <w:p/>
     <w:p/>
     <w:p/>
+    <w:p/>
+    <w:p/>
+    <w:p/>
   </w:footnote>
 </w:footnotes>
-</file>
-
-<file path=word/header1.xml><?xml version="1.0" encoding="utf-8"?>
-<w:hdr xmlns:wpc="http://schemas.microsoft.com/office/word/2010/wordprocessingCanvas" xmlns:cx="http://schemas.microsoft.com/office/drawing/2014/chartex" xmlns:cx1="http://schemas.microsoft.com/office/drawing/2015/9/8/chartex" xmlns:cx2="http://schemas.microsoft.com/office/drawing/2015/10/21/chartex" xmlns:cx3="http://schemas.microsoft.com/office/drawing/2016/5/9/chartex" xmlns:cx4="http://schemas.microsoft.com/office/drawing/2016/5/10/chartex" xmlns:cx5="http://schemas.microsoft.com/office/drawing/2016/5/11/chartex" xmlns:cx6="http://schemas.microsoft.com/office/drawing/2016/5/12/chartex" xmlns:cx7="http://schemas.microsoft.com/office/drawing/2016/5/13/chartex" xmlns:cx8="http://schemas.microsoft.com/office/drawing/2016/5/14/chartex" xmlns:mc="http://schemas.openxmlformats.org/markup-compatibility/2006" xmlns:aink="http://schemas.microsoft.com/office/drawing/2016/ink" xmlns:am3d="http://schemas.microsoft.com/office/drawing/2017/model3d" xmlns:o="urn:schemas-microsoft-com:office:office" xmlns:r="http://schemas.openxmlformats.org/officeDocument/2006/relationships" xmlns:m="http://schemas.openxmlformats.org/officeDocument/2006/math" xmlns:v="urn:schemas-microsoft-com:vml" xmlns:wp14="http://schemas.microsoft.com/office/word/2010/wordprocessingDrawing" xmlns:wp="http://schemas.openxmlformats.org/drawingml/2006/wordprocessingDrawing" xmlns:w10="urn:schemas-microsoft-com:office:word" xmlns:w="http://schemas.openxmlformats.org/wordprocessingml/2006/main" xmlns:w14="http://schemas.microsoft.com/office/word/2010/wordml" xmlns:w15="http://schemas.microsoft.com/office/word/2012/wordml" xmlns:w16cex="http://schemas.microsoft.com/office/word/2018/wordml/cex" xmlns:w16cid="http://schemas.microsoft.com/office/word/2016/wordml/cid" xmlns:w16="http://schemas.microsoft.com/office/word/2018/wordml" xmlns:w16sdtdh="http://schemas.microsoft.com/office/word/2020/wordml/sdtdatahash" xmlns:w16se="http://schemas.microsoft.com/office/word/2015/wordml/symex" xmlns:wpg="http://schemas.microsoft.com/office/word/2010/wordprocessingGroup" xmlns:wpi="http://schemas.microsoft.com/office/word/2010/wordprocessingInk" xmlns:wne="http://schemas.microsoft.com/office/word/2006/wordml" xmlns:wps="http://schemas.microsoft.com/office/word/2010/wordprocessingShape" mc:Ignorable="w14 w15 w16se w16cid w16 w16cex w16sdtdh wp14">
-  <w:p>
-    <w:pPr>
-      <w:pStyle w:val="Header"/>
-    </w:pPr>
-  </w:p>
-</w:hdr>
-</file>
-
-<file path=word/header2.xml><?xml version="1.0" encoding="utf-8"?>
-<w:hdr xmlns:wpc="http://schemas.microsoft.com/office/word/2010/wordprocessingCanvas" xmlns:cx="http://schemas.microsoft.com/office/drawing/2014/chartex" xmlns:cx1="http://schemas.microsoft.com/office/drawing/2015/9/8/chartex" xmlns:cx2="http://schemas.microsoft.com/office/drawing/2015/10/21/chartex" xmlns:cx3="http://schemas.microsoft.com/office/drawing/2016/5/9/chartex" xmlns:cx4="http://schemas.microsoft.com/office/drawing/2016/5/10/chartex" xmlns:cx5="http://schemas.microsoft.com/office/drawing/2016/5/11/chartex" xmlns:cx6="http://schemas.microsoft.com/office/drawing/2016/5/12/chartex" xmlns:cx7="http://schemas.microsoft.com/office/drawing/2016/5/13/chartex" xmlns:cx8="http://schemas.microsoft.com/office/drawing/2016/5/14/chartex" xmlns:mc="http://schemas.openxmlformats.org/markup-compatibility/2006" xmlns:aink="http://schemas.microsoft.com/office/drawing/2016/ink" xmlns:am3d="http://schemas.microsoft.com/office/drawing/2017/model3d" xmlns:o="urn:schemas-microsoft-com:office:office" xmlns:r="http://schemas.openxmlformats.org/officeDocument/2006/relationships" xmlns:m="http://schemas.openxmlformats.org/officeDocument/2006/math" xmlns:v="urn:schemas-microsoft-com:vml" xmlns:wp14="http://schemas.microsoft.com/office/word/2010/wordprocessingDrawing" xmlns:wp="http://schemas.openxmlformats.org/drawingml/2006/wordprocessingDrawing" xmlns:w10="urn:schemas-microsoft-com:office:word" xmlns:w="http://schemas.openxmlformats.org/wordprocessingml/2006/main" xmlns:w14="http://schemas.microsoft.com/office/word/2010/wordml" xmlns:w15="http://schemas.microsoft.com/office/word/2012/wordml" xmlns:w16cex="http://schemas.microsoft.com/office/word/2018/wordml/cex" xmlns:w16cid="http://schemas.microsoft.com/office/word/2016/wordml/cid" xmlns:w16="http://schemas.microsoft.com/office/word/2018/wordml" xmlns:w16sdtdh="http://schemas.microsoft.com/office/word/2020/wordml/sdtdatahash" xmlns:w16se="http://schemas.microsoft.com/office/word/2015/wordml/symex" xmlns:wpg="http://schemas.microsoft.com/office/word/2010/wordprocessingGroup" xmlns:wpi="http://schemas.microsoft.com/office/word/2010/wordprocessingInk" xmlns:wne="http://schemas.microsoft.com/office/word/2006/wordml" xmlns:wps="http://schemas.microsoft.com/office/word/2010/wordprocessingShape" mc:Ignorable="w14 w15 w16se w16cid w16 w16cex w16sdtdh wp14">
-  <w:p>
-    <w:pPr>
-      <w:pStyle w:val="Header"/>
-    </w:pPr>
-  </w:p>
-</w:hdr>
-</file>
-
-<file path=word/header3.xml><?xml version="1.0" encoding="utf-8"?>
-<w:hdr xmlns:wpc="http://schemas.microsoft.com/office/word/2010/wordprocessingCanvas" xmlns:cx="http://schemas.microsoft.com/office/drawing/2014/chartex" xmlns:cx1="http://schemas.microsoft.com/office/drawing/2015/9/8/chartex" xmlns:cx2="http://schemas.microsoft.com/office/drawing/2015/10/21/chartex" xmlns:cx3="http://schemas.microsoft.com/office/drawing/2016/5/9/chartex" xmlns:cx4="http://schemas.microsoft.com/office/drawing/2016/5/10/chartex" xmlns:cx5="http://schemas.microsoft.com/office/drawing/2016/5/11/chartex" xmlns:cx6="http://schemas.microsoft.com/office/drawing/2016/5/12/chartex" xmlns:cx7="http://schemas.microsoft.com/office/drawing/2016/5/13/chartex" xmlns:cx8="http://schemas.microsoft.com/office/drawing/2016/5/14/chartex" xmlns:mc="http://schemas.openxmlformats.org/markup-compatibility/2006" xmlns:aink="http://schemas.microsoft.com/office/drawing/2016/ink" xmlns:am3d="http://schemas.microsoft.com/office/drawing/2017/model3d" xmlns:o="urn:schemas-microsoft-com:office:office" xmlns:r="http://schemas.openxmlformats.org/officeDocument/2006/relationships" xmlns:m="http://schemas.openxmlformats.org/officeDocument/2006/math" xmlns:v="urn:schemas-microsoft-com:vml" xmlns:wp14="http://schemas.microsoft.com/office/word/2010/wordprocessingDrawing" xmlns:wp="http://schemas.openxmlformats.org/drawingml/2006/wordprocessingDrawing" xmlns:w10="urn:schemas-microsoft-com:office:word" xmlns:w="http://schemas.openxmlformats.org/wordprocessingml/2006/main" xmlns:w14="http://schemas.microsoft.com/office/word/2010/wordml" xmlns:w15="http://schemas.microsoft.com/office/word/2012/wordml" xmlns:w16cex="http://schemas.microsoft.com/office/word/2018/wordml/cex" xmlns:w16cid="http://schemas.microsoft.com/office/word/2016/wordml/cid" xmlns:w16="http://schemas.microsoft.com/office/word/2018/wordml" xmlns:w16sdtdh="http://schemas.microsoft.com/office/word/2020/wordml/sdtdatahash" xmlns:w16se="http://schemas.microsoft.com/office/word/2015/wordml/symex" xmlns:wpg="http://schemas.microsoft.com/office/word/2010/wordprocessingGroup" xmlns:wpi="http://schemas.microsoft.com/office/word/2010/wordprocessingInk" xmlns:wne="http://schemas.microsoft.com/office/word/2006/wordml" xmlns:wps="http://schemas.microsoft.com/office/word/2010/wordprocessingShape" mc:Ignorable="w14 w15 w16se w16cid w16 w16cex w16sdtdh wp14">
-  <w:p>
-    <w:pPr>
-      <w:pStyle w:val="Header"/>
-    </w:pPr>
-  </w:p>
-</w:hdr>
 </file>
 
 <file path=word/numbering.xml><?xml version="1.0" encoding="utf-8"?>

</xml_diff>